<commit_message>
10/4 weigh-in logged with waist at 30.5; Day C logged irritation-free with new arm exercises kept; Oct 5-9 LinkedIn drafts updated; dashboard refreshes; history updated
</commit_message>
<xml_diff>
--- a/outputs/linkedin/2026-10-05-to-10-09-drafts.docx
+++ b/outputs/linkedin/2026-10-05-to-10-09-drafts.docx
@@ -55,13 +55,7 @@
         <w:spacing w:after="160"/>
       </w:pPr>
       <w:r>
-        <w:t>Have you ever wondered why revenue can be</w:t>
-      </w:r>
-      <w:r>
-        <w:t xml:space="preserve"> growing</w:t>
-      </w:r>
-      <w:r>
-        <w:t xml:space="preserve"> but profit be so flat? Believe it or not, that’s more common than we realize. (Okay – so there is that element of costs going up but hopefully you’re keeping up with price adjustments.) </w:t>
+        <w:t>Have you ever wondered what anthropology has to do with running a business? (I'm studying it now, so I think about this more than most!)</w:t>
       </w:r>
     </w:p>
     <w:p>
@@ -69,16 +63,31 @@
         <w:spacing w:after="160"/>
       </w:pPr>
       <w:r>
-        <w:t>With increased revenue often comes increased complexity. The way to add a bit of balance back in your financial numbers is by removing unnecessary complexity and</w:t>
-      </w:r>
-      <w:r>
-        <w:t xml:space="preserve"> updating</w:t>
-      </w:r>
-      <w:r>
-        <w:t xml:space="preserve"> </w:t>
-      </w:r>
-      <w:r>
-        <w:t xml:space="preserve">processes that better align with your growth.  </w:t>
+        <w:t>Companies like Intel and Xerox have hired anthropologists for decades to watch how people actually work, because what people say they do and what they really do are rarely the same.</w:t>
+      </w:r>
+    </w:p>
+    <w:p>
+      <w:pPr>
+        <w:spacing w:after="160"/>
+      </w:pPr>
+      <w:r>
+        <w:t>That gap matters more once a business passes $1M. There are enough people that we can't see everything anymore, and the way work gets done has drifted from the way everyone describes it.</w:t>
+      </w:r>
+    </w:p>
+    <w:p>
+      <w:pPr>
+        <w:spacing w:after="160"/>
+      </w:pPr>
+      <w:r>
+        <w:t>One trick I've borrowed from anthropologists: instead of asking "what's our process?", ask "walk me through the last time this happened." You'll hear what really goes on.</w:t>
+      </w:r>
+    </w:p>
+    <w:p>
+      <w:pPr>
+        <w:spacing w:after="160"/>
+      </w:pPr>
+      <w:r>
+        <w:t>What do you think you'd find if you watched how the work actually gets done in your business?</w:t>
       </w:r>
     </w:p>
     <w:p>

</xml_diff>